<commit_message>
Fix PO specification document encoding and diagrams
</commit_message>
<xml_diff>
--- a/outputs/specifications/specification_detection_conformite_product_owner.docx
+++ b/outputs/specifications/specification_detection_conformite_product_owner.docx
@@ -7,7 +7,7 @@
         <w:pStyle w:val="Title"/>
       </w:pPr>
       <w:r>
-        <w:t xml:space="preserve">Sp?cification - D?tection conformit? NLP</w:t>
+        <w:t xml:space="preserve">Spécification - Détection conformité NLP</w:t>
       </w:r>
     </w:p>
     <w:p>
@@ -15,7 +15,7 @@
         <w:rPr>
           <w:i/>
         </w:rPr>
-        <w:t xml:space="preserve">Document de synth?se pour Product Owner - 22 juin 2026</w:t>
+        <w:t xml:space="preserve">Document de synthèse pour Product Owner - 22 juin 2026</w:t>
       </w:r>
     </w:p>
     <w:p>
@@ -23,17 +23,17 @@
         <w:pStyle w:val="Heading1"/>
       </w:pPr>
       <w:r>
-        <w:t xml:space="preserve">R?sum? ex?cutif</w:t>
-      </w:r>
-    </w:p>
-    <w:p>
-      <w:r>
-        <w:t xml:space="preserve">Le dispositif analyse des textes ou documents d?adh?sion afin de d?tecter des alertes de conformit?. Il compare quatre strat?gies compl?mentaires : r?gles d?terministes, analyse linguistique spaCy, reconnaissance d?entit?s GLiNER et expressions r?guli?res pour donn?es structur?es.</w:t>
-      </w:r>
-    </w:p>
-    <w:p>
-      <w:r>
-        <w:t xml:space="preserve">Les r?sultats sont consolid?s sous forme de Findings avec moteur, r?gle, section, terme d?tect?, score et m?tadonn?es de branche.</w:t>
+        <w:t xml:space="preserve">Résumé exécutif</w:t>
+      </w:r>
+    </w:p>
+    <w:p>
+      <w:r>
+        <w:t xml:space="preserve">Le dispositif analyse des textes ou documents d’adhésion afin de détecter des alertes de conformité. Il compare quatre stratégies complémentaires : règles déterministes, analyse linguistique spaCy, reconnaissance d’entités GLiNER et expressions régulières pour données structurées.</w:t>
+      </w:r>
+    </w:p>
+    <w:p>
+      <w:r>
+        <w:t xml:space="preserve">Les résultats sont consolidés sous forme de Findings avec moteur, règle, section, terme détecté, score et métadonnées de branche.</w:t>
       </w:r>
     </w:p>
     <w:p>
@@ -41,7 +41,7 @@
         <w:pStyle w:val="Heading1"/>
       </w:pPr>
       <w:r>
-        <w:t xml:space="preserve">1. Sp?cification Fonctionnelle</w:t>
+        <w:t xml:space="preserve">1. Spécification Fonctionnelle</w:t>
       </w:r>
     </w:p>
     <w:p>
@@ -54,20 +54,24 @@
     </w:p>
     <w:p>
       <w:r>
-        <w:t xml:space="preserve">D?tecter automatiquement des alertes de conformit? dans des documents ou textes de test, pour faciliter la revue m?tier et la comparaison des approches de reconnaissance.</w:t>
-      </w:r>
-    </w:p>
-    <w:p>
-      <w:pPr>
-        <w:pStyle w:val="Heading2"/>
-      </w:pPr>
-      <w:r>
-        <w:t xml:space="preserve">P?rim?tre fonctionnel</w:t>
-      </w:r>
-    </w:p>
-    <w:p>
-      <w:pPr>
-        <w:pStyle w:val="ListBullet"/>
+        <w:t xml:space="preserve">Détecter automatiquement des alertes de conformité dans des documents ou textes de test, pour faciliter la revue métier et la comparaison des approches de reconnaissance.</w:t>
+      </w:r>
+    </w:p>
+    <w:p>
+      <w:pPr>
+        <w:pStyle w:val="Heading2"/>
+      </w:pPr>
+      <w:r>
+        <w:t xml:space="preserve">Périmètre fonctionnel</w:t>
+      </w:r>
+    </w:p>
+    <w:p>
+      <w:pPr>
+        <w:pStyle w:val="ListBullet"/>
+        <w:numPr>
+          <w:ilvl w:val="0"/>
+          <w:numId w:val="1"/>
+        </w:numPr>
       </w:pPr>
       <w:r>
         <w:t>Analyser un document complet ou des cas de test textuels.</w:t>
@@ -76,30 +80,46 @@
     <w:p>
       <w:pPr>
         <w:pStyle w:val="ListBullet"/>
-      </w:pPr>
-      <w:r>
-        <w:t>D?couper le texte en sections m?tier lorsque le document suit la structure attendue.</w:t>
-      </w:r>
-    </w:p>
-    <w:p>
-      <w:pPr>
-        <w:pStyle w:val="ListBullet"/>
-      </w:pPr>
-      <w:r>
-        <w:t>Activer ou d?sactiver chaque branche de d?tection depuis les notebooks.</w:t>
-      </w:r>
-    </w:p>
-    <w:p>
-      <w:pPr>
-        <w:pStyle w:val="ListBullet"/>
-      </w:pPr>
-      <w:r>
-        <w:t>Comparer les scores et les r?sultats par branche.</w:t>
-      </w:r>
-    </w:p>
-    <w:p>
-      <w:pPr>
-        <w:pStyle w:val="ListBullet"/>
+        <w:numPr>
+          <w:ilvl w:val="0"/>
+          <w:numId w:val="1"/>
+        </w:numPr>
+      </w:pPr>
+      <w:r>
+        <w:t>Découper le texte en sections métier lorsque le document suit la structure attendue.</w:t>
+      </w:r>
+    </w:p>
+    <w:p>
+      <w:pPr>
+        <w:pStyle w:val="ListBullet"/>
+        <w:numPr>
+          <w:ilvl w:val="0"/>
+          <w:numId w:val="1"/>
+        </w:numPr>
+      </w:pPr>
+      <w:r>
+        <w:t>Activer ou désactiver chaque branche de détection depuis les notebooks.</w:t>
+      </w:r>
+    </w:p>
+    <w:p>
+      <w:pPr>
+        <w:pStyle w:val="ListBullet"/>
+        <w:numPr>
+          <w:ilvl w:val="0"/>
+          <w:numId w:val="1"/>
+        </w:numPr>
+      </w:pPr>
+      <w:r>
+        <w:t>Comparer les scores et les résultats par branche.</w:t>
+      </w:r>
+    </w:p>
+    <w:p>
+      <w:pPr>
+        <w:pStyle w:val="ListBullet"/>
+        <w:numPr>
+          <w:ilvl w:val="0"/>
+          <w:numId w:val="1"/>
+        </w:numPr>
       </w:pPr>
       <w:r>
         <w:t>Centraliser les cas de test dans configs/test_cases.csv.</w:t>
@@ -108,9 +128,13 @@
     <w:p>
       <w:pPr>
         <w:pStyle w:val="ListBullet"/>
-      </w:pPr>
-      <w:r>
-        <w:t>Conserver les mod?les localement dans D:\Workspaces\modelStore et le cache dans D:\Workspaces\ModelCache.</w:t>
+        <w:numPr>
+          <w:ilvl w:val="0"/>
+          <w:numId w:val="1"/>
+        </w:numPr>
+      </w:pPr>
+      <w:r>
+        <w:t>Conserver les modèles localement dans D:\Workspaces\modelStore et le cache dans D:\Workspaces\ModelCache.</w:t>
       </w:r>
     </w:p>
     <w:p>
@@ -149,7 +173,7 @@
               <w:rPr>
                 <w:b/>
               </w:rPr>
-              <w:t xml:space="preserve">R?le fonctionnel</w:t>
+              <w:t xml:space="preserve">Rôle fonctionnel</w:t>
             </w:r>
           </w:p>
         </w:tc>
@@ -162,7 +186,7 @@
               <w:rPr>
                 <w:b/>
               </w:rPr>
-              <w:t xml:space="preserve">Exemples de d?tection</w:t>
+              <w:t xml:space="preserve">Exemples de détection</w:t>
             </w:r>
           </w:p>
         </w:tc>
@@ -180,15 +204,15 @@
           <w:tcPr/>
           <w:p>
             <w:r>
-              <w:t xml:space="preserve">Contr?les d?terministes ? partir du r?f?rentiel m?tier CSV.</w:t>
-            </w:r>
-          </w:p>
-        </w:tc>
-        <w:tc>
-          <w:tcPr/>
-          <w:p>
-            <w:r>
-              <w:t xml:space="preserve">sans risque, garantie, mes proches, diab?tique</w:t>
+              <w:t xml:space="preserve">Contrôles déterministes à partir du référentiel métier CSV.</w:t>
+            </w:r>
+          </w:p>
+        </w:tc>
+        <w:tc>
+          <w:tcPr/>
+          <w:p>
+            <w:r>
+              <w:t xml:space="preserve">sans risque, garantie, mes proches, diabétique</w:t>
             </w:r>
           </w:p>
         </w:tc>
@@ -206,15 +230,15 @@
           <w:tcPr/>
           <w:p>
             <w:r>
-              <w:t xml:space="preserve">Contr?les linguistiques enrichis par lemmatisation et synonymes contr?l?s.</w:t>
-            </w:r>
-          </w:p>
-        </w:tc>
-        <w:tc>
-          <w:tcPr/>
-          <w:p>
-            <w:r>
-              <w:t xml:space="preserve">garantis, insuline, formes fl?chies</w:t>
+              <w:t xml:space="preserve">Contrôles linguistiques enrichis par lemmatisation et synonymes contrôlés.</w:t>
+            </w:r>
+          </w:p>
+        </w:tc>
+        <w:tc>
+          <w:tcPr/>
+          <w:p>
+            <w:r>
+              <w:t xml:space="preserve">garantis, insuline, formes fléchies</w:t>
             </w:r>
           </w:p>
         </w:tc>
@@ -232,15 +256,15 @@
           <w:tcPr/>
           <w:p>
             <w:r>
-              <w:t xml:space="preserve">Reconnaissance d?entit?s et de concepts ? partir de labels configurables.</w:t>
-            </w:r>
-          </w:p>
-        </w:tc>
-        <w:tc>
-          <w:tcPr/>
-          <w:p>
-            <w:r>
-              <w:t xml:space="preserve">maladie, opinion politique, donn?e biom?trique</w:t>
+              <w:t xml:space="preserve">Reconnaissance d’entités et de concepts à partir de labels configurables.</w:t>
+            </w:r>
+          </w:p>
+        </w:tc>
+        <w:tc>
+          <w:tcPr/>
+          <w:p>
+            <w:r>
+              <w:t xml:space="preserve">maladie, opinion politique, donnée biométrique</w:t>
             </w:r>
           </w:p>
         </w:tc>
@@ -258,15 +282,15 @@
           <w:tcPr/>
           <w:p>
             <w:r>
-              <w:t xml:space="preserve">D?tection d?terministe de formats structur?s.</w:t>
-            </w:r>
-          </w:p>
-        </w:tc>
-        <w:tc>
-          <w:tcPr/>
-          <w:p>
-            <w:r>
-              <w:t xml:space="preserve">email, t?l?phone, IBAN, NIR</w:t>
+              <w:t xml:space="preserve">Détection déterministe de formats structurés.</w:t>
+            </w:r>
+          </w:p>
+        </w:tc>
+        <w:tc>
+          <w:tcPr/>
+          <w:p>
+            <w:r>
+              <w:t xml:space="preserve">email, téléphone, IBAN, NIR</w:t>
             </w:r>
           </w:p>
         </w:tc>
@@ -281,10 +305,13 @@
       </w:r>
     </w:p>
     <w:p>
+      <w:pPr>
+        <w:jc w:val="center"/>
+      </w:pPr>
       <w:r>
         <w:drawing>
           <wp:inline distT="0" distB="0" distL="0" distR="0">
-            <wp:extent cx="6217920" cy="3482035"/>
+            <wp:extent cx="6035040" cy="3376052"/>
             <wp:docPr id="2" name="architecture_fonctionnelle"/>
             <a:graphic>
               <a:graphicData uri="http://schemas.openxmlformats.org/drawingml/2006/picture">
@@ -302,7 +329,7 @@
                   <pic:spPr>
                     <a:xfrm>
                       <a:off x="0" y="0"/>
-                      <a:ext cx="6217920" cy="3482035"/>
+                      <a:ext cx="6035040" cy="3376052"/>
                     </a:xfrm>
                     <a:prstGeom prst="rect">
                       <a:avLst/>
@@ -320,39 +347,55 @@
         <w:pStyle w:val="Heading2"/>
       </w:pPr>
       <w:r>
-        <w:t xml:space="preserve">Crit?res d?acceptation fonctionnels</w:t>
-      </w:r>
-    </w:p>
-    <w:p>
-      <w:pPr>
-        <w:pStyle w:val="ListBullet"/>
-      </w:pPr>
-      <w:r>
-        <w:t>Chaque alerte indique le moteur, la r?gle ou cat?gorie, le terme d?tect?, le score et la section.</w:t>
-      </w:r>
-    </w:p>
-    <w:p>
-      <w:pPr>
-        <w:pStyle w:val="ListBullet"/>
-      </w:pPr>
-      <w:r>
-        <w:t>Les branches sont comparables sur les m?mes cas de test.</w:t>
-      </w:r>
-    </w:p>
-    <w:p>
-      <w:pPr>
-        <w:pStyle w:val="ListBullet"/>
-      </w:pPr>
-      <w:r>
-        <w:t>Les mod?les ne sont pas t?l?charg?s ? chaque ex?cution.</w:t>
-      </w:r>
-    </w:p>
-    <w:p>
-      <w:pPr>
-        <w:pStyle w:val="ListBullet"/>
-      </w:pPr>
-      <w:r>
-        <w:t>Le Product Owner peut identifier les faux positifs, les faux n?gatifs et les ?carts entre branches.</w:t>
+        <w:t xml:space="preserve">Critères d’acceptation fonctionnels</w:t>
+      </w:r>
+    </w:p>
+    <w:p>
+      <w:pPr>
+        <w:pStyle w:val="ListBullet"/>
+        <w:numPr>
+          <w:ilvl w:val="0"/>
+          <w:numId w:val="1"/>
+        </w:numPr>
+      </w:pPr>
+      <w:r>
+        <w:t>Chaque alerte indique le moteur, la règle ou catégorie, le terme détecté, le score et la section.</w:t>
+      </w:r>
+    </w:p>
+    <w:p>
+      <w:pPr>
+        <w:pStyle w:val="ListBullet"/>
+        <w:numPr>
+          <w:ilvl w:val="0"/>
+          <w:numId w:val="1"/>
+        </w:numPr>
+      </w:pPr>
+      <w:r>
+        <w:t>Les branches sont comparables sur les mêmes cas de test.</w:t>
+      </w:r>
+    </w:p>
+    <w:p>
+      <w:pPr>
+        <w:pStyle w:val="ListBullet"/>
+        <w:numPr>
+          <w:ilvl w:val="0"/>
+          <w:numId w:val="1"/>
+        </w:numPr>
+      </w:pPr>
+      <w:r>
+        <w:t>Les modèles ne sont pas téléchargés à chaque exécution.</w:t>
+      </w:r>
+    </w:p>
+    <w:p>
+      <w:pPr>
+        <w:pStyle w:val="ListBullet"/>
+        <w:numPr>
+          <w:ilvl w:val="0"/>
+          <w:numId w:val="1"/>
+        </w:numPr>
+      </w:pPr>
+      <w:r>
+        <w:t>Le Product Owner peut identifier les faux positifs, les faux négatifs et les écarts entre branches.</w:t>
       </w:r>
     </w:p>
     <w:p>
@@ -360,7 +403,7 @@
         <w:pStyle w:val="Heading1"/>
       </w:pPr>
       <w:r>
-        <w:t xml:space="preserve">2. Sp?cification Technique</w:t>
+        <w:t xml:space="preserve">2. Spécification Technique</w:t>
       </w:r>
     </w:p>
     <w:p>
@@ -399,7 +442,7 @@
               <w:rPr>
                 <w:b/>
               </w:rPr>
-              <w:t xml:space="preserve">Responsabilit?</w:t>
+              <w:t xml:space="preserve">Responsabilité</w:t>
             </w:r>
           </w:p>
         </w:tc>
@@ -417,7 +460,7 @@
           <w:tcPr/>
           <w:p>
             <w:r>
-              <w:t xml:space="preserve">Orchestration des branches, agr?gation des r?sultats et m?tadonn?es.</w:t>
+              <w:t xml:space="preserve">Orchestration des branches, agrégation des résultats et métadonnées.</w:t>
             </w:r>
           </w:p>
         </w:tc>
@@ -435,7 +478,7 @@
           <w:tcPr/>
           <w:p>
             <w:r>
-              <w:t xml:space="preserve">Application des r?gles m?tier d?terministes.</w:t>
+              <w:t xml:space="preserve">Application des règles métier déterministes.</w:t>
             </w:r>
           </w:p>
         </w:tc>
@@ -453,7 +496,7 @@
           <w:tcPr/>
           <w:p>
             <w:r>
-              <w:t xml:space="preserve">Branche spaCy avec fr_core_news_md et synonymes contr?l?s.</w:t>
+              <w:t xml:space="preserve">Branche spaCy avec fr_core_news_md et synonymes contrôlés.</w:t>
             </w:r>
           </w:p>
         </w:tc>
@@ -471,7 +514,7 @@
           <w:tcPr/>
           <w:p>
             <w:r>
-              <w:t xml:space="preserve">Branche GLiNER avec mod?le local et labels configurables.</w:t>
+              <w:t xml:space="preserve">Branche GLiNER avec modèle local et labels configurables.</w:t>
             </w:r>
           </w:p>
         </w:tc>
@@ -489,7 +532,7 @@
           <w:tcPr/>
           <w:p>
             <w:r>
-              <w:t xml:space="preserve">Branche regex pour donn?es structur?es.</w:t>
+              <w:t xml:space="preserve">Branche regex pour données structurées.</w:t>
             </w:r>
           </w:p>
         </w:tc>
@@ -507,7 +550,7 @@
           <w:tcPr/>
           <w:p>
             <w:r>
-              <w:t xml:space="preserve">Cas de test centralis?s.</w:t>
+              <w:t xml:space="preserve">Cas de test centralisés.</w:t>
             </w:r>
           </w:p>
         </w:tc>
@@ -525,7 +568,7 @@
           <w:tcPr/>
           <w:p>
             <w:r>
-              <w:t xml:space="preserve">Synonymes propos?s pour spaCy uniquement.</w:t>
+              <w:t xml:space="preserve">Synonymes proposés pour spaCy uniquement.</w:t>
             </w:r>
           </w:p>
         </w:tc>
@@ -558,10 +601,13 @@
       </w:r>
     </w:p>
     <w:p>
+      <w:pPr>
+        <w:jc w:val="center"/>
+      </w:pPr>
       <w:r>
         <w:drawing>
           <wp:inline distT="0" distB="0" distL="0" distR="0">
-            <wp:extent cx="6217920" cy="3482035"/>
+            <wp:extent cx="6035040" cy="3478383"/>
             <wp:docPr id="3" name="architecture_technique"/>
             <a:graphic>
               <a:graphicData uri="http://schemas.openxmlformats.org/drawingml/2006/picture">
@@ -579,7 +625,7 @@
                   <pic:spPr>
                     <a:xfrm>
                       <a:off x="0" y="0"/>
-                      <a:ext cx="6217920" cy="3482035"/>
+                      <a:ext cx="6035040" cy="3478383"/>
                     </a:xfrm>
                     <a:prstGeom prst="rect">
                       <a:avLst/>
@@ -597,7 +643,7 @@
         <w:pStyle w:val="Heading1"/>
       </w:pPr>
       <w:r>
-        <w:t xml:space="preserve">3. Sp?cificit?s des Branches</w:t>
+        <w:t xml:space="preserve">3. Spécificités des Branches</w:t>
       </w:r>
     </w:p>
     <w:p>
@@ -609,10 +655,13 @@
       </w:r>
     </w:p>
     <w:p>
+      <w:pPr>
+        <w:jc w:val="center"/>
+      </w:pPr>
       <w:r>
         <w:drawing>
           <wp:inline distT="0" distB="0" distL="0" distR="0">
-            <wp:extent cx="6217920" cy="3482035"/>
+            <wp:extent cx="6035040" cy="3151392"/>
             <wp:docPr id="4" name="specificites_branches"/>
             <a:graphic>
               <a:graphicData uri="http://schemas.openxmlformats.org/drawingml/2006/picture">
@@ -630,7 +679,7 @@
                   <pic:spPr>
                     <a:xfrm>
                       <a:off x="0" y="0"/>
-                      <a:ext cx="6217920" cy="3482035"/>
+                      <a:ext cx="6035040" cy="3151392"/>
                     </a:xfrm>
                     <a:prstGeom prst="rect">
                       <a:avLst/>
@@ -715,23 +764,23 @@
           <w:tcPr/>
           <w:p>
             <w:r>
-              <w:t xml:space="preserve">R?gles textuelles exactes, synonymes CSV m?tier, fuzzy simple.</w:t>
-            </w:r>
-          </w:p>
-        </w:tc>
-        <w:tc>
-          <w:tcPr/>
-          <w:p>
-            <w:r>
-              <w:t xml:space="preserve">Tr?s explicable et stable.</w:t>
-            </w:r>
-          </w:p>
-        </w:tc>
-        <w:tc>
-          <w:tcPr/>
-          <w:p>
-            <w:r>
-              <w:t xml:space="preserve">Peu de compr?hension du sens.</w:t>
+              <w:t xml:space="preserve">Règles textuelles exactes, synonymes CSV métier, fuzzy simple.</w:t>
+            </w:r>
+          </w:p>
+        </w:tc>
+        <w:tc>
+          <w:tcPr/>
+          <w:p>
+            <w:r>
+              <w:t xml:space="preserve">Très explicable et stable.</w:t>
+            </w:r>
+          </w:p>
+        </w:tc>
+        <w:tc>
+          <w:tcPr/>
+          <w:p>
+            <w:r>
+              <w:t xml:space="preserve">Peu de compréhension du sens.</w:t>
             </w:r>
           </w:p>
         </w:tc>
@@ -749,7 +798,7 @@
           <w:tcPr/>
           <w:p>
             <w:r>
-              <w:t xml:space="preserve">Lemmes, racines, variantes grammaticales, synonymes contr?l?s s?par?s.</w:t>
+              <w:t xml:space="preserve">Lemmes, racines, variantes grammaticales, synonymes contrôlés séparés.</w:t>
             </w:r>
           </w:p>
         </w:tc>
@@ -765,7 +814,7 @@
           <w:tcPr/>
           <w:p>
             <w:r>
-              <w:t xml:space="preserve">D?pend du mod?le et du r?f?rentiel de synonymes.</w:t>
+              <w:t xml:space="preserve">Dépend du modèle et du référentiel de synonymes.</w:t>
             </w:r>
           </w:p>
         </w:tc>
@@ -783,23 +832,23 @@
           <w:tcPr/>
           <w:p>
             <w:r>
-              <w:t xml:space="preserve">Entit?s et concepts via labels configurables.</w:t>
-            </w:r>
-          </w:p>
-        </w:tc>
-        <w:tc>
-          <w:tcPr/>
-          <w:p>
-            <w:r>
-              <w:t xml:space="preserve">Capacit? s?mantique plus large.</w:t>
-            </w:r>
-          </w:p>
-        </w:tc>
-        <w:tc>
-          <w:tcPr/>
-          <w:p>
-            <w:r>
-              <w:t xml:space="preserve">Moins d?terministe, sensible aux labels et seuils.</w:t>
+              <w:t xml:space="preserve">Entités et concepts via labels configurables.</w:t>
+            </w:r>
+          </w:p>
+        </w:tc>
+        <w:tc>
+          <w:tcPr/>
+          <w:p>
+            <w:r>
+              <w:t xml:space="preserve">Capacité sémantique plus large.</w:t>
+            </w:r>
+          </w:p>
+        </w:tc>
+        <w:tc>
+          <w:tcPr/>
+          <w:p>
+            <w:r>
+              <w:t xml:space="preserve">Moins déterministe, sensible aux labels et seuils.</w:t>
             </w:r>
           </w:p>
         </w:tc>
@@ -817,15 +866,15 @@
           <w:tcPr/>
           <w:p>
             <w:r>
-              <w:t xml:space="preserve">Expressions r?guli?res sur formats structur?s.</w:t>
-            </w:r>
-          </w:p>
-        </w:tc>
-        <w:tc>
-          <w:tcPr/>
-          <w:p>
-            <w:r>
-              <w:t xml:space="preserve">Tr?s fiable sur formats connus.</w:t>
+              <w:t xml:space="preserve">Expressions régulières sur formats structurés.</w:t>
+            </w:r>
+          </w:p>
+        </w:tc>
+        <w:tc>
+          <w:tcPr/>
+          <w:p>
+            <w:r>
+              <w:t xml:space="preserve">Très fiable sur formats connus.</w:t>
             </w:r>
           </w:p>
         </w:tc>
@@ -849,7 +898,7 @@
     </w:p>
     <w:p>
       <w:r>
-        <w:t xml:space="preserve">La branche generic est le moteur de r?f?rence d?terministe. Elle lit les termes, synonymes m?tier, seuils et cat?gories depuis configs/generic_detection_rules.csv. Elle applique des recherches exactes, des rapprochements de racines simples et du fuzzy matching. Elle est recommand?e comme base robuste et audit?e.</w:t>
+        <w:t xml:space="preserve">La branche generic est le moteur de référence déterministe. Elle lit les termes, synonymes métier, seuils et catégories depuis configs/generic_detection_rules.csv. Elle applique des recherches exactes, des rapprochements de racines simples et du fuzzy matching. Elle est recommandée comme base robuste et auditée.</w:t>
       </w:r>
     </w:p>
     <w:p>
@@ -862,7 +911,7 @@
     </w:p>
     <w:p>
       <w:r>
-        <w:t xml:space="preserve">La branche spaCy utilise le mod?le local fr_core_news_md. Elle n?utilise plus les synonymes du CSV m?tier principal. Elle part des termes interdits puis enrichit la reconnaissance via configs/spacy_synonyms.csv. Cette s?paration permet de comparer l?effet de l?enrichissement linguistique sans modifier le r?f?rentiel m?tier principal.</w:t>
+        <w:t xml:space="preserve">La branche spaCy utilise le modèle local fr_core_news_md. Elle n’utilise plus les synonymes du CSV métier principal. Elle part des termes interdits puis enrichit la reconnaissance via configs/spacy_synonyms.csv. Cette séparation permet de comparer l’effet de l’enrichissement linguistique sans modifier le référentiel métier principal.</w:t>
       </w:r>
     </w:p>
     <w:p>
@@ -875,7 +924,7 @@
     </w:p>
     <w:p>
       <w:r>
-        <w:t xml:space="preserve">La branche GLiNER d?tecte des entit?s ou concepts via des labels configurables. Elle permet de rep?rer des notions plus larges comme maladie, opinion politique ou donn?e biom?trique. Le r?sultat d?pend du mod?le local, du seuil et du libell? des labels.</w:t>
+        <w:t xml:space="preserve">La branche GLiNER détecte des entités ou concepts via des labels configurables. Elle permet de repérer des notions plus larges comme maladie, opinion politique ou donnée biométrique. Le résultat dépend du modèle local, du seuil et du libellé des labels.</w:t>
       </w:r>
     </w:p>
     <w:p>
@@ -888,7 +937,7 @@
     </w:p>
     <w:p>
       <w:r>
-        <w:t xml:space="preserve">La branche regex d?tecte des donn?es personnelles structur?es sans mod?le : adresse email, t?l?phone fran?ais, IBAN fran?ais et NIR fran?ais. Elle est rapide, d?terministe et utile pour des formats normalis?s.</w:t>
+        <w:t xml:space="preserve">La branche regex détecte des données personnelles structurées sans modèle : adresse email, téléphone français, IBAN français et NIR français. Elle est rapide, déterministe et utile pour des formats normalisés.</w:t>
       </w:r>
     </w:p>
     <w:p>
@@ -902,41 +951,76 @@
     <w:p>
       <w:pPr>
         <w:pStyle w:val="ListBullet"/>
-      </w:pPr>
-      <w:r>
-        <w:t>Utiliser le notebook 03e pour comparer les branches sur les m?mes cas.</w:t>
-      </w:r>
-    </w:p>
-    <w:p>
-      <w:pPr>
-        <w:pStyle w:val="ListBullet"/>
-      </w:pPr>
-      <w:r>
-        <w:t>Analyser les ?carts entre generic et spaCy pour mesurer l?apport linguistique.</w:t>
-      </w:r>
-    </w:p>
-    <w:p>
-      <w:pPr>
-        <w:pStyle w:val="ListBullet"/>
-      </w:pPr>
-      <w:r>
-        <w:t>Analyser GLiNER s?par?ment pour les concepts sensibles non strictement couverts par les r?gles.</w:t>
-      </w:r>
-    </w:p>
-    <w:p>
-      <w:pPr>
-        <w:pStyle w:val="ListBullet"/>
-      </w:pPr>
-      <w:r>
-        <w:t>Utiliser regex comme contr?le sp?cialis? sur les donn?es structur?es.</w:t>
+        <w:numPr>
+          <w:ilvl w:val="0"/>
+          <w:numId w:val="1"/>
+        </w:numPr>
+      </w:pPr>
+      <w:r>
+        <w:t>Utiliser le notebook 03e pour comparer les branches sur les mêmes cas.</w:t>
+      </w:r>
+    </w:p>
+    <w:p>
+      <w:pPr>
+        <w:pStyle w:val="ListBullet"/>
+        <w:numPr>
+          <w:ilvl w:val="0"/>
+          <w:numId w:val="1"/>
+        </w:numPr>
+      </w:pPr>
+      <w:r>
+        <w:t>Analyser les écarts entre generic et spaCy pour mesurer l’apport linguistique.</w:t>
+      </w:r>
+    </w:p>
+    <w:p>
+      <w:pPr>
+        <w:pStyle w:val="ListBullet"/>
+        <w:numPr>
+          <w:ilvl w:val="0"/>
+          <w:numId w:val="1"/>
+        </w:numPr>
+      </w:pPr>
+      <w:r>
+        <w:t>Analyser GLiNER séparément pour les concepts sensibles non strictement couverts par les règles.</w:t>
+      </w:r>
+    </w:p>
+    <w:p>
+      <w:pPr>
+        <w:pStyle w:val="ListBullet"/>
+        <w:numPr>
+          <w:ilvl w:val="0"/>
+          <w:numId w:val="1"/>
+        </w:numPr>
+      </w:pPr>
+      <w:r>
+        <w:t>Utiliser regex comme contrôle spécialisé sur les données structurées.</w:t>
       </w:r>
     </w:p>
     <w:sectPr>
       <w:pgSz w:w="11906" w:h="16838"/>
-      <w:pgMar w:top="1000" w:right="900" w:bottom="1000" w:left="900" w:header="708" w:footer="708" w:gutter="0"/>
+      <w:pgMar w:top="1000" w:right="850" w:bottom="1000" w:left="850" w:header="708" w:footer="708" w:gutter="0"/>
     </w:sectPr>
   </w:body>
 </w:document>
+</file>
+
+<file path=word/numbering.xml><?xml version="1.0" encoding="utf-8"?>
+<w:numbering xmlns:w="http://schemas.openxmlformats.org/wordprocessingml/2006/main">
+  <w:abstractNum w:abstractNumId="0">
+    <w:lvl w:ilvl="0">
+      <w:start w:val="1"/>
+      <w:numFmt w:val="bullet"/>
+      <w:lvlText w:val="•"/>
+      <w:lvlJc w:val="left"/>
+      <w:pPr>
+        <w:ind w:left="720" w:hanging="360"/>
+      </w:pPr>
+    </w:lvl>
+  </w:abstractNum>
+  <w:num w:numId="1">
+    <w:abstractNumId w:val="0"/>
+  </w:num>
+</w:numbering>
 </file>
 
 <file path=word/styles.xml><?xml version="1.0" encoding="utf-8"?>
@@ -944,8 +1028,8 @@
   <w:style w:type="paragraph" w:styleId="Normal">
     <w:name w:val="Normal"/>
     <w:rPr>
+      <w:rFonts w:ascii="Aptos" w:hAnsi="Aptos"/>
       <w:sz w:val="22"/>
-      <w:szCs w:val="22"/>
     </w:rPr>
   </w:style>
   <w:style w:type="paragraph" w:styleId="Title">

</xml_diff>